<commit_message>
Meeting Agenda Updated and Timesheet explained
</commit_message>
<xml_diff>
--- a/Documentation/Week 4/Meeting_Agenda_Week_4.docx
+++ b/Documentation/Week 4/Meeting_Agenda_Week_4.docx
@@ -344,7 +344,25 @@
                 <w:sz w:val="24"/>
                 <w:szCs w:val="24"/>
               </w:rPr>
-              <w:t>Ensure everyone knows where there Sprint 1 Deliverables get saved/pushed to</w:t>
+              <w:t xml:space="preserve">Ensure everyone knows where </w:t>
+            </w:r>
+            <w:proofErr w:type="gramStart"/>
+            <w:r>
+              <w:rPr>
+                <w:rFonts w:ascii="Times New Roman" w:hAnsi="Times New Roman" w:cs="Times New Roman"/>
+                <w:sz w:val="24"/>
+                <w:szCs w:val="24"/>
+              </w:rPr>
+              <w:t>there</w:t>
+            </w:r>
+            <w:proofErr w:type="gramEnd"/>
+            <w:r>
+              <w:rPr>
+                <w:rFonts w:ascii="Times New Roman" w:hAnsi="Times New Roman" w:cs="Times New Roman"/>
+                <w:sz w:val="24"/>
+                <w:szCs w:val="24"/>
+              </w:rPr>
+              <w:t xml:space="preserve"> Sprint 1 Deliverables get saved/pushed to</w:t>
             </w:r>
           </w:p>
         </w:tc>
@@ -611,6 +629,37 @@
                 <w:szCs w:val="24"/>
               </w:rPr>
               <w:t>Finish Sprint 1 Deliverables</w:t>
+            </w:r>
+            <w:r>
+              <w:rPr>
+                <w:rFonts w:ascii="Times New Roman" w:hAnsi="Times New Roman" w:cs="Times New Roman"/>
+                <w:sz w:val="24"/>
+                <w:szCs w:val="24"/>
+              </w:rPr>
+              <w:t xml:space="preserve"> by 5pm today</w:t>
+            </w:r>
+          </w:p>
+          <w:p>
+            <w:pPr>
+              <w:pStyle w:val="ListParagraph"/>
+              <w:numPr>
+                <w:ilvl w:val="0"/>
+                <w:numId w:val="1"/>
+              </w:numPr>
+              <w:spacing w:line="360" w:lineRule="auto"/>
+              <w:rPr>
+                <w:rFonts w:ascii="Times New Roman" w:hAnsi="Times New Roman" w:cs="Times New Roman"/>
+                <w:sz w:val="24"/>
+                <w:szCs w:val="24"/>
+              </w:rPr>
+            </w:pPr>
+            <w:r>
+              <w:rPr>
+                <w:rFonts w:ascii="Times New Roman" w:hAnsi="Times New Roman" w:cs="Times New Roman"/>
+                <w:sz w:val="24"/>
+                <w:szCs w:val="24"/>
+              </w:rPr>
+              <w:t>Submit sprint deliverables (Christo)</w:t>
             </w:r>
           </w:p>
           <w:p>

</xml_diff>